<commit_message>
create COCO no bbox pe result
</commit_message>
<xml_diff>
--- a/Final Report/Doc1.docx
+++ b/Final Report/Doc1.docx
@@ -15836,6 +15836,9 @@
     <w:p>
       <w:pPr>
         <w:pStyle w:val="Heading3"/>
+        <w:rPr>
+          <w:lang w:val="vi-VN"/>
+        </w:rPr>
       </w:pPr>
       <w:bookmarkStart w:id="44" w:name="_Toc222008223"/>
       <w:r>
@@ -15868,13 +15871,140 @@
     </w:p>
     <w:p>
       <w:pPr>
-        <w:rPr>
-          <w:lang w:val="en-US"/>
-        </w:rPr>
-      </w:pPr>
-    </w:p>
-    <w:p>
-      <w:pPr>
+        <w:spacing w:line="360" w:lineRule="auto"/>
+        <w:jc w:val="both"/>
+        <w:rPr>
+          <w:lang w:val="en-US"/>
+        </w:rPr>
+      </w:pPr>
+      <w:r>
+        <w:rPr>
+          <w:lang w:val="vi-VN"/>
+        </w:rPr>
+        <w:t xml:space="preserve">By effectively removing the bounding box coordinates input into the CRTNet, the model tends to lose the </w:t>
+      </w:r>
+      <w:r>
+        <w:rPr>
+          <w:lang w:val="vi-VN"/>
+        </w:rPr>
+        <w:t>“</w:t>
+      </w:r>
+      <w:r>
+        <w:rPr>
+          <w:lang w:val="vi-VN"/>
+        </w:rPr>
+        <w:t>sense</w:t>
+      </w:r>
+      <w:r>
+        <w:rPr>
+          <w:lang w:val="vi-VN"/>
+        </w:rPr>
+        <w:t>”</w:t>
+      </w:r>
+      <w:r>
+        <w:rPr>
+          <w:lang w:val="vi-VN"/>
+        </w:rPr>
+        <w:t xml:space="preserve"> of the target coordinates in the context scene. </w:t>
+      </w:r>
+      <w:r>
+        <w:rPr>
+          <w:lang w:val="vi-VN"/>
+        </w:rPr>
+        <w:t>To reintroduce the target coordinates without requiring additional inputs, the model</w:t>
+      </w:r>
+      <w:r>
+        <w:rPr>
+          <w:lang w:val="en-US"/>
+        </w:rPr>
+        <w:t xml:space="preserve">’s </w:t>
+      </w:r>
+      <w:r>
+        <w:rPr>
+          <w:lang w:val="vi-VN"/>
+        </w:rPr>
+        <w:t xml:space="preserve">architecture is adjusted by </w:t>
+      </w:r>
+      <w:r>
+        <w:rPr>
+          <w:lang w:val="en-US"/>
+        </w:rPr>
+        <w:t>adding a</w:t>
+      </w:r>
+      <w:r>
+        <w:rPr>
+          <w:lang w:val="vi-VN"/>
+        </w:rPr>
+        <w:t xml:space="preserve"> lightweight attention layer, with the target</w:t>
+      </w:r>
+      <w:r>
+        <w:rPr>
+          <w:lang w:val="en-US"/>
+        </w:rPr>
+        <w:t xml:space="preserve"> tokens as</w:t>
+      </w:r>
+      <w:r>
+        <w:rPr>
+          <w:lang w:val="vi-VN"/>
+        </w:rPr>
+        <w:t xml:space="preserve"> </w:t>
+      </w:r>
+      <w:r>
+        <w:rPr>
+          <w:lang w:val="vi-VN"/>
+        </w:rPr>
+        <w:t>the Query inpu</w:t>
+      </w:r>
+      <w:r>
+        <w:rPr>
+          <w:lang w:val="en-US"/>
+        </w:rPr>
+        <w:t>t</w:t>
+      </w:r>
+      <w:r>
+        <w:rPr>
+          <w:lang w:val="vi-VN"/>
+        </w:rPr>
+        <w:t xml:space="preserve">, </w:t>
+      </w:r>
+      <w:r>
+        <w:rPr>
+          <w:lang w:val="en-US"/>
+        </w:rPr>
+        <w:t xml:space="preserve">and </w:t>
+      </w:r>
+      <w:r>
+        <w:rPr>
+          <w:lang w:val="vi-VN"/>
+        </w:rPr>
+        <w:t>positional encoding</w:t>
+      </w:r>
+      <w:r>
+        <w:rPr>
+          <w:lang w:val="en-US"/>
+        </w:rPr>
+        <w:t xml:space="preserve"> as Key and Value inputs</w:t>
+      </w:r>
+      <w:r>
+        <w:rPr>
+          <w:lang w:val="vi-VN"/>
+        </w:rPr>
+        <w:t>.</w:t>
+      </w:r>
+    </w:p>
+    <w:p>
+      <w:pPr>
+        <w:spacing w:line="360" w:lineRule="auto"/>
+        <w:jc w:val="both"/>
+        <w:rPr>
+          <w:lang w:val="en-US"/>
+        </w:rPr>
+      </w:pPr>
+    </w:p>
+    <w:p>
+      <w:pPr>
+        <w:spacing w:line="360" w:lineRule="auto"/>
+        <w:jc w:val="center"/>
         <w:rPr>
           <w:lang w:val="en-US"/>
         </w:rPr>
@@ -15885,9 +16015,9 @@
           <w:lang w:val="en-US"/>
         </w:rPr>
         <w:drawing>
-          <wp:inline distT="0" distB="0" distL="0" distR="0" wp14:anchorId="2CA03D29" wp14:editId="42141420">
-            <wp:extent cx="5099026" cy="5576207"/>
-            <wp:effectExtent l="0" t="0" r="0" b="0"/>
+          <wp:inline distT="0" distB="0" distL="0" distR="0" wp14:anchorId="2CA03D29" wp14:editId="04D1753B">
+            <wp:extent cx="4888265" cy="5345723"/>
+            <wp:effectExtent l="0" t="0" r="1270" b="1270"/>
             <wp:docPr id="140745157" name="Picture 1" descr="A screenshot of a computer program&#10;&#10;AI-generated content may be incorrect."/>
             <wp:cNvGraphicFramePr>
               <a:graphicFrameLocks xmlns:a="http://schemas.openxmlformats.org/drawingml/2006/main" noChangeAspect="1"/>
@@ -15908,7 +16038,7 @@
                   <pic:spPr>
                     <a:xfrm>
                       <a:off x="0" y="0"/>
-                      <a:ext cx="5103118" cy="5580682"/>
+                      <a:ext cx="4907088" cy="5366307"/>
                     </a:xfrm>
                     <a:prstGeom prst="rect">
                       <a:avLst/>
@@ -15924,6 +16054,7 @@
     <w:p>
       <w:pPr>
         <w:pStyle w:val="Caption"/>
+        <w:spacing w:line="360" w:lineRule="auto"/>
         <w:jc w:val="center"/>
         <w:rPr>
           <w:sz w:val="24"/>
@@ -16042,59 +16173,6 @@
         <w:t xml:space="preserve"> Positional Encoding Layer with Cross-Attention Mechanism</w:t>
       </w:r>
       <w:bookmarkEnd w:id="45"/>
-    </w:p>
-    <w:p>
-      <w:pPr>
-        <w:rPr>
-          <w:lang w:val="en-US"/>
-        </w:rPr>
-      </w:pPr>
-    </w:p>
-    <w:p>
-      <w:pPr>
-        <w:rPr>
-          <w:lang w:val="en-US"/>
-        </w:rPr>
-      </w:pPr>
-    </w:p>
-    <w:p>
-      <w:pPr>
-        <w:rPr>
-          <w:b/>
-          <w:bCs/>
-          <w:sz w:val="28"/>
-          <w:szCs w:val="28"/>
-          <w:lang w:val="en-US"/>
-        </w:rPr>
-      </w:pPr>
-    </w:p>
-    <w:p>
-      <w:pPr>
-        <w:rPr>
-          <w:lang w:val="en-US"/>
-        </w:rPr>
-      </w:pPr>
-    </w:p>
-    <w:p>
-      <w:pPr>
-        <w:rPr>
-          <w:lang w:val="en-US"/>
-        </w:rPr>
-      </w:pPr>
-    </w:p>
-    <w:p>
-      <w:pPr>
-        <w:rPr>
-          <w:lang w:val="en-US"/>
-        </w:rPr>
-      </w:pPr>
-    </w:p>
-    <w:p>
-      <w:pPr>
-        <w:rPr>
-          <w:lang w:val="en-US"/>
-        </w:rPr>
-      </w:pPr>
     </w:p>
     <w:p>
       <w:pPr>

</xml_diff>

<commit_message>
generate all 3 results
</commit_message>
<xml_diff>
--- a/Final Report/Doc1.docx
+++ b/Final Report/Doc1.docx
@@ -15881,12 +15881,24 @@
         <w:rPr>
           <w:lang w:val="vi-VN"/>
         </w:rPr>
-        <w:t xml:space="preserve">By effectively removing the bounding box coordinates input into the CRTNet, the model tends to lose the </w:t>
+        <w:t>By effectively removing the bounding box coordinates</w:t>
+      </w:r>
+      <w:r>
+        <w:rPr>
+          <w:lang w:val="en-US"/>
+        </w:rPr>
+        <w:t xml:space="preserve"> as</w:t>
       </w:r>
       <w:r>
         <w:rPr>
           <w:lang w:val="vi-VN"/>
         </w:rPr>
+        <w:t xml:space="preserve"> input into the CRTNet, the model tends to lose the </w:t>
+      </w:r>
+      <w:r>
+        <w:rPr>
+          <w:lang w:val="vi-VN"/>
+        </w:rPr>
         <w:t>“</w:t>
       </w:r>
       <w:r>
@@ -15947,59 +15959,68 @@
         <w:rPr>
           <w:lang w:val="vi-VN"/>
         </w:rPr>
-        <w:t xml:space="preserve"> </w:t>
+        <w:t xml:space="preserve"> the Query inpu</w:t>
+      </w:r>
+      <w:r>
+        <w:rPr>
+          <w:lang w:val="en-US"/>
+        </w:rPr>
+        <w:t>t</w:t>
       </w:r>
       <w:r>
         <w:rPr>
           <w:lang w:val="vi-VN"/>
         </w:rPr>
-        <w:t>the Query inpu</w:t>
-      </w:r>
-      <w:r>
-        <w:rPr>
-          <w:lang w:val="en-US"/>
-        </w:rPr>
-        <w:t>t</w:t>
+        <w:t xml:space="preserve">, </w:t>
+      </w:r>
+      <w:r>
+        <w:rPr>
+          <w:lang w:val="en-US"/>
+        </w:rPr>
+        <w:t xml:space="preserve">and </w:t>
       </w:r>
       <w:r>
         <w:rPr>
           <w:lang w:val="vi-VN"/>
         </w:rPr>
-        <w:t xml:space="preserve">, </w:t>
-      </w:r>
-      <w:r>
-        <w:rPr>
-          <w:lang w:val="en-US"/>
-        </w:rPr>
-        <w:t xml:space="preserve">and </w:t>
+        <w:t>positional encoding</w:t>
+      </w:r>
+      <w:r>
+        <w:rPr>
+          <w:lang w:val="en-US"/>
+        </w:rPr>
+        <w:t xml:space="preserve"> as Key and Value inputs</w:t>
+      </w:r>
+      <w:r>
+        <w:rPr>
+          <w:lang w:val="en-US"/>
+        </w:rPr>
+        <w:t xml:space="preserve"> to learn to make sense of the surrounding context </w:t>
+      </w:r>
+      <w:r>
+        <w:rPr>
+          <w:lang w:val="en-US"/>
+        </w:rPr>
+        <w:t>and</w:t>
+      </w:r>
+      <w:r>
+        <w:rPr>
+          <w:lang w:val="en-US"/>
+        </w:rPr>
+        <w:t xml:space="preserve"> apply appropriate positional encoding</w:t>
+      </w:r>
+      <w:r>
+        <w:rPr>
+          <w:lang w:val="en-US"/>
+        </w:rPr>
+        <w:t>s</w:t>
       </w:r>
       <w:r>
         <w:rPr>
           <w:lang w:val="vi-VN"/>
         </w:rPr>
-        <w:t>positional encoding</w:t>
-      </w:r>
-      <w:r>
-        <w:rPr>
-          <w:lang w:val="en-US"/>
-        </w:rPr>
-        <w:t xml:space="preserve"> as Key and Value inputs</w:t>
-      </w:r>
-      <w:r>
-        <w:rPr>
-          <w:lang w:val="vi-VN"/>
-        </w:rPr>
         <w:t>.</w:t>
       </w:r>
-    </w:p>
-    <w:p>
-      <w:pPr>
-        <w:spacing w:line="360" w:lineRule="auto"/>
-        <w:jc w:val="both"/>
-        <w:rPr>
-          <w:lang w:val="en-US"/>
-        </w:rPr>
-      </w:pPr>
     </w:p>
     <w:p>
       <w:pPr>
@@ -17140,7 +17161,19 @@
           <w:lang w:val="vi-VN"/>
         </w:rPr>
         <w:lastRenderedPageBreak/>
-        <w:t>The model’s attention output behaves differently in training phases. The testing phase in the early training stage reveals that the attention mechanism from the last decoder layers contributes to the recognition task, and attention produced by previous layers tends to be distributed uniformly. In the later training epochs, the performance of the model in the testing phase keeps increasing, and the attention map in all the layers is approaching a uniform distribution, which could imply that preserving the original context tends to improve the recognition performance when training with the lack of target information (target image is blacked out), the recognition prediction is entirely based on the context information. However, the CRTNet task in this paper is to act as an advisor for the ViT model, so we will use an early checkpoint from the early epochs to transfer learning to the TCT model. The combination of a later epoch of the CRTNet with the ViT, however, can hinder the TCT model’s visual search performance.</w:t>
+        <w:t>The model’s attention output behaves differently in training phases. The testing phase in the early training stage reveals that the attention mechanism from the last decoder layers contributes to the recognition task, and attention produced by previous layers tends to be distributed uniformly. In the later training epochs, the performance of the model in the testing phase keeps increasing, and the attention map in all the layers is approaching a uniform distribution, which could imply that preserving the original context tends to improve the recognition performance when training with the lack of target information (target image is blacked out), the recognition prediction is entirely based on the context information. However, the CRTNet task in this paper is to act as an advisor</w:t>
+      </w:r>
+      <w:r>
+        <w:rPr>
+          <w:lang w:val="en-US"/>
+        </w:rPr>
+        <w:t xml:space="preserve"> (global/context guidance)</w:t>
+      </w:r>
+      <w:r>
+        <w:rPr>
+          <w:lang w:val="vi-VN"/>
+        </w:rPr>
+        <w:t xml:space="preserve"> for the ViT model, so we will use an early checkpoint from the early epochs to transfer learning to the TCT model. The combination of a later epoch of the CRTNet with the ViT, however, can hinder the TCT model’s visual search performance.</w:t>
       </w:r>
     </w:p>
     <w:p>
@@ -17171,6 +17204,20 @@
         <w:t>COCO-Search18</w:t>
       </w:r>
       <w:bookmarkEnd w:id="56"/>
+    </w:p>
+    <w:p>
+      <w:pPr>
+        <w:rPr>
+          <w:lang w:val="en-US"/>
+        </w:rPr>
+      </w:pPr>
+    </w:p>
+    <w:p>
+      <w:pPr>
+        <w:rPr>
+          <w:lang w:val="en-US"/>
+        </w:rPr>
+      </w:pPr>
     </w:p>
     <w:p>
       <w:pPr>
@@ -17298,10 +17345,62 @@
     </w:p>
     <w:p>
       <w:pPr>
-        <w:rPr>
-          <w:lang w:val="en-US"/>
-        </w:rPr>
-      </w:pPr>
+        <w:pStyle w:val="Heading2"/>
+      </w:pPr>
+      <w:r>
+        <w:t>Possible Limitations</w:t>
+      </w:r>
+    </w:p>
+    <w:p>
+      <w:pPr>
+        <w:rPr>
+          <w:lang w:val="en-US"/>
+        </w:rPr>
+      </w:pPr>
+    </w:p>
+    <w:p>
+      <w:pPr>
+        <w:rPr>
+          <w:lang w:val="en-US"/>
+        </w:rPr>
+      </w:pPr>
+    </w:p>
+    <w:p>
+      <w:pPr>
+        <w:pStyle w:val="Heading2"/>
+      </w:pPr>
+      <w:r>
+        <w:t>Contributions</w:t>
+      </w:r>
+    </w:p>
+    <w:p>
+      <w:pPr>
+        <w:rPr>
+          <w:lang w:val="en-US"/>
+        </w:rPr>
+      </w:pPr>
+    </w:p>
+    <w:p>
+      <w:pPr>
+        <w:rPr>
+          <w:lang w:val="en-US"/>
+        </w:rPr>
+      </w:pPr>
+    </w:p>
+    <w:p>
+      <w:pPr>
+        <w:rPr>
+          <w:lang w:val="en-US"/>
+        </w:rPr>
+      </w:pPr>
+    </w:p>
+    <w:p>
+      <w:pPr>
+        <w:pStyle w:val="Heading2"/>
+      </w:pPr>
+      <w:r>
+        <w:t>Future directions</w:t>
+      </w:r>
     </w:p>
     <w:p>
       <w:pPr>
@@ -17504,30 +17603,7 @@
           <w:iCs/>
           <w:lang w:val="en-GB"/>
         </w:rPr>
-        <w:t>Microsoft COCO: Common Objects in Context</w:t>
-      </w:r>
-      <w:r>
-        <w:rPr>
-          <w:rFonts w:cs="Times New Roman"/>
-          <w:lang w:val="en-GB"/>
-        </w:rPr>
-        <w:t xml:space="preserve"> (arXiv:1405.0312). arXiv. https://doi.org/10.48550/arXiv.1405.0312</w:t>
-      </w:r>
-    </w:p>
-    <w:p>
-      <w:pPr>
-        <w:pStyle w:val="Bibliography"/>
-        <w:rPr>
-          <w:rFonts w:cs="Times New Roman"/>
-          <w:lang w:val="en-GB"/>
-        </w:rPr>
-      </w:pPr>
-      <w:r>
-        <w:rPr>
-          <w:rFonts w:cs="Times New Roman"/>
-          <w:lang w:val="en-GB"/>
-        </w:rPr>
-        <w:t xml:space="preserve">Posner, M. I. (1980). Orienting of Attention. </w:t>
+        <w:t xml:space="preserve">Microsoft COCO: Common </w:t>
       </w:r>
       <w:r>
         <w:rPr>
@@ -17536,14 +17612,31 @@
           <w:iCs/>
           <w:lang w:val="en-GB"/>
         </w:rPr>
-        <w:t>Quarterly Journal of Experimental Psychology</w:t>
+        <w:lastRenderedPageBreak/>
+        <w:t>Objects in Context</w:t>
       </w:r>
       <w:r>
         <w:rPr>
           <w:rFonts w:cs="Times New Roman"/>
           <w:lang w:val="en-GB"/>
         </w:rPr>
-        <w:t xml:space="preserve">, </w:t>
+        <w:t xml:space="preserve"> (arXiv:1405.0312). arXiv. https://doi.org/10.48550/arXiv.1405.0312</w:t>
+      </w:r>
+    </w:p>
+    <w:p>
+      <w:pPr>
+        <w:pStyle w:val="Bibliography"/>
+        <w:rPr>
+          <w:rFonts w:cs="Times New Roman"/>
+          <w:lang w:val="en-GB"/>
+        </w:rPr>
+      </w:pPr>
+      <w:r>
+        <w:rPr>
+          <w:rFonts w:cs="Times New Roman"/>
+          <w:lang w:val="en-GB"/>
+        </w:rPr>
+        <w:t xml:space="preserve">Posner, M. I. (1980). Orienting of Attention. </w:t>
       </w:r>
       <w:r>
         <w:rPr>
@@ -17552,30 +17645,14 @@
           <w:iCs/>
           <w:lang w:val="en-GB"/>
         </w:rPr>
-        <w:t>32</w:t>
+        <w:t>Quarterly Journal of Experimental Psychology</w:t>
       </w:r>
       <w:r>
         <w:rPr>
           <w:rFonts w:cs="Times New Roman"/>
           <w:lang w:val="en-GB"/>
         </w:rPr>
-        <w:t>(1), 3–25. https://doi.org/10.1080/00335558008248231</w:t>
-      </w:r>
-    </w:p>
-    <w:p>
-      <w:pPr>
-        <w:pStyle w:val="Bibliography"/>
-        <w:rPr>
-          <w:rFonts w:cs="Times New Roman"/>
-          <w:lang w:val="en-GB"/>
-        </w:rPr>
-      </w:pPr>
-      <w:r>
-        <w:rPr>
-          <w:rFonts w:cs="Times New Roman"/>
-          <w:lang w:val="en-GB"/>
-        </w:rPr>
-        <w:t xml:space="preserve">Posner, M. I., &amp; Cohen, Y. (1984). Components of Visual Orienting. In H. Bouma &amp; D. G. Bouwhuis (Eds.), </w:t>
+        <w:t xml:space="preserve">, </w:t>
       </w:r>
       <w:r>
         <w:rPr>
@@ -17584,14 +17661,14 @@
           <w:iCs/>
           <w:lang w:val="en-GB"/>
         </w:rPr>
-        <w:t>Attention and Performance X</w:t>
+        <w:t>32</w:t>
       </w:r>
       <w:r>
         <w:rPr>
           <w:rFonts w:cs="Times New Roman"/>
           <w:lang w:val="en-GB"/>
         </w:rPr>
-        <w:t xml:space="preserve"> (pp. 531–556). Lawrence Erlbaum Associates.</w:t>
+        <w:t>(1), 3–25. https://doi.org/10.1080/00335558008248231</w:t>
       </w:r>
     </w:p>
     <w:p>
@@ -17607,8 +17684,7 @@
           <w:rFonts w:cs="Times New Roman"/>
           <w:lang w:val="en-GB"/>
         </w:rPr>
-        <w:lastRenderedPageBreak/>
-        <w:t xml:space="preserve">Simonyan, K., &amp; Zisserman, A. (2014). </w:t>
+        <w:t xml:space="preserve">Posner, M. I., &amp; Cohen, Y. (1984). Components of Visual Orienting. In H. Bouma &amp; D. G. Bouwhuis (Eds.), </w:t>
       </w:r>
       <w:r>
         <w:rPr>
@@ -17617,14 +17693,14 @@
           <w:iCs/>
           <w:lang w:val="en-GB"/>
         </w:rPr>
-        <w:t>Very Deep Convolutional Networks for Large-Scale Image Recognition</w:t>
+        <w:t>Attention and Performance X</w:t>
       </w:r>
       <w:r>
         <w:rPr>
           <w:rFonts w:cs="Times New Roman"/>
           <w:lang w:val="en-GB"/>
         </w:rPr>
-        <w:t xml:space="preserve"> (Version 6). arXiv. https://doi.org/10.48550/ARXIV.1409.1556</w:t>
+        <w:t xml:space="preserve"> (pp. 531–556). Lawrence Erlbaum Associates.</w:t>
       </w:r>
     </w:p>
     <w:p>
@@ -17640,7 +17716,7 @@
           <w:rFonts w:cs="Times New Roman"/>
           <w:lang w:val="en-GB"/>
         </w:rPr>
-        <w:t xml:space="preserve">Treisman, A. M., &amp; Gelade, G. (1980). A feature-integration theory of attention. </w:t>
+        <w:t xml:space="preserve">Simonyan, K., &amp; Zisserman, A. (2014). </w:t>
       </w:r>
       <w:r>
         <w:rPr>
@@ -17649,14 +17725,30 @@
           <w:iCs/>
           <w:lang w:val="en-GB"/>
         </w:rPr>
-        <w:t>Cognitive Psychology</w:t>
+        <w:t>Very Deep Convolutional Networks for Large-Scale Image Recognition</w:t>
       </w:r>
       <w:r>
         <w:rPr>
           <w:rFonts w:cs="Times New Roman"/>
           <w:lang w:val="en-GB"/>
         </w:rPr>
-        <w:t xml:space="preserve">, </w:t>
+        <w:t xml:space="preserve"> (Version 6). arXiv. https://doi.org/10.48550/ARXIV.1409.1556</w:t>
+      </w:r>
+    </w:p>
+    <w:p>
+      <w:pPr>
+        <w:pStyle w:val="Bibliography"/>
+        <w:rPr>
+          <w:rFonts w:cs="Times New Roman"/>
+          <w:lang w:val="en-GB"/>
+        </w:rPr>
+      </w:pPr>
+      <w:r>
+        <w:rPr>
+          <w:rFonts w:cs="Times New Roman"/>
+          <w:lang w:val="en-GB"/>
+        </w:rPr>
+        <w:t xml:space="preserve">Treisman, A. M., &amp; Gelade, G. (1980). A feature-integration theory of attention. </w:t>
       </w:r>
       <w:r>
         <w:rPr>
@@ -17665,30 +17757,14 @@
           <w:iCs/>
           <w:lang w:val="en-GB"/>
         </w:rPr>
-        <w:t>12</w:t>
+        <w:t>Cognitive Psychology</w:t>
       </w:r>
       <w:r>
         <w:rPr>
           <w:rFonts w:cs="Times New Roman"/>
           <w:lang w:val="en-GB"/>
         </w:rPr>
-        <w:t>(1), 97–136. https://doi.org/10.1016/0010-0285(80)90005-5</w:t>
-      </w:r>
-    </w:p>
-    <w:p>
-      <w:pPr>
-        <w:pStyle w:val="Bibliography"/>
-        <w:rPr>
-          <w:rFonts w:cs="Times New Roman"/>
-          <w:lang w:val="en-GB"/>
-        </w:rPr>
-      </w:pPr>
-      <w:r>
-        <w:rPr>
-          <w:rFonts w:cs="Times New Roman"/>
-          <w:lang w:val="en-GB"/>
-        </w:rPr>
-        <w:t xml:space="preserve">Vaswani, A., Shazeer, N., Parmar, N., Uszkoreit, J., Jones, L., Gomez, A. N., Kaiser, L., &amp; Polosukhin, I. (2023). </w:t>
+        <w:t xml:space="preserve">, </w:t>
       </w:r>
       <w:r>
         <w:rPr>
@@ -17697,14 +17773,14 @@
           <w:iCs/>
           <w:lang w:val="en-GB"/>
         </w:rPr>
-        <w:t>Attention Is All You Need</w:t>
+        <w:t>12</w:t>
       </w:r>
       <w:r>
         <w:rPr>
           <w:rFonts w:cs="Times New Roman"/>
           <w:lang w:val="en-GB"/>
         </w:rPr>
-        <w:t xml:space="preserve"> (arXiv:1706.03762). arXiv. https://doi.org/10.48550/arXiv.1706.03762</w:t>
+        <w:t>(1), 97–136. https://doi.org/10.1016/0010-0285(80)90005-5</w:t>
       </w:r>
     </w:p>
     <w:p>
@@ -17720,7 +17796,7 @@
           <w:rFonts w:cs="Times New Roman"/>
           <w:lang w:val="en-GB"/>
         </w:rPr>
-        <w:t xml:space="preserve">Wolfe, J. M. (1994). Guided Search 2.0 A revised model of visual search. </w:t>
+        <w:t xml:space="preserve">Vaswani, A., Shazeer, N., Parmar, N., Uszkoreit, J., Jones, L., Gomez, A. N., Kaiser, L., &amp; Polosukhin, I. (2023). </w:t>
       </w:r>
       <w:r>
         <w:rPr>
@@ -17729,14 +17805,30 @@
           <w:iCs/>
           <w:lang w:val="en-GB"/>
         </w:rPr>
-        <w:t>Psychonomic Bulletin &amp; Review</w:t>
+        <w:t>Attention Is All You Need</w:t>
       </w:r>
       <w:r>
         <w:rPr>
           <w:rFonts w:cs="Times New Roman"/>
           <w:lang w:val="en-GB"/>
         </w:rPr>
-        <w:t xml:space="preserve">, </w:t>
+        <w:t xml:space="preserve"> (arXiv:1706.03762). arXiv. https://doi.org/10.48550/arXiv.1706.03762</w:t>
+      </w:r>
+    </w:p>
+    <w:p>
+      <w:pPr>
+        <w:pStyle w:val="Bibliography"/>
+        <w:rPr>
+          <w:rFonts w:cs="Times New Roman"/>
+          <w:lang w:val="en-GB"/>
+        </w:rPr>
+      </w:pPr>
+      <w:r>
+        <w:rPr>
+          <w:rFonts w:cs="Times New Roman"/>
+          <w:lang w:val="en-GB"/>
+        </w:rPr>
+        <w:t xml:space="preserve">Wolfe, J. M. (1994). Guided Search 2.0 A revised model of visual search. </w:t>
       </w:r>
       <w:r>
         <w:rPr>
@@ -17745,30 +17837,14 @@
           <w:iCs/>
           <w:lang w:val="en-GB"/>
         </w:rPr>
-        <w:t>1</w:t>
+        <w:t>Psychonomic Bulletin &amp; Review</w:t>
       </w:r>
       <w:r>
         <w:rPr>
           <w:rFonts w:cs="Times New Roman"/>
           <w:lang w:val="en-GB"/>
         </w:rPr>
-        <w:t>(2), 202–238. https://doi.org/10.3758/BF03200774</w:t>
-      </w:r>
-    </w:p>
-    <w:p>
-      <w:pPr>
-        <w:pStyle w:val="Bibliography"/>
-        <w:rPr>
-          <w:rFonts w:cs="Times New Roman"/>
-          <w:lang w:val="en-GB"/>
-        </w:rPr>
-      </w:pPr>
-      <w:r>
-        <w:rPr>
-          <w:rFonts w:cs="Times New Roman"/>
-          <w:lang w:val="en-GB"/>
-        </w:rPr>
-        <w:t xml:space="preserve">Wolfe, J. M. (2021). Guided Search 6.0: An updated model of visual search. </w:t>
+        <w:t xml:space="preserve">, </w:t>
       </w:r>
       <w:r>
         <w:rPr>
@@ -17777,14 +17853,30 @@
           <w:iCs/>
           <w:lang w:val="en-GB"/>
         </w:rPr>
-        <w:t>Psychonomic Bulletin &amp; Review</w:t>
+        <w:t>1</w:t>
       </w:r>
       <w:r>
         <w:rPr>
           <w:rFonts w:cs="Times New Roman"/>
           <w:lang w:val="en-GB"/>
         </w:rPr>
-        <w:t xml:space="preserve">, </w:t>
+        <w:t>(2), 202–238. https://doi.org/10.3758/BF03200774</w:t>
+      </w:r>
+    </w:p>
+    <w:p>
+      <w:pPr>
+        <w:pStyle w:val="Bibliography"/>
+        <w:rPr>
+          <w:rFonts w:cs="Times New Roman"/>
+          <w:lang w:val="en-GB"/>
+        </w:rPr>
+      </w:pPr>
+      <w:r>
+        <w:rPr>
+          <w:rFonts w:cs="Times New Roman"/>
+          <w:lang w:val="en-GB"/>
+        </w:rPr>
+        <w:t xml:space="preserve">Wolfe, J. M. (2021). Guided Search 6.0: An updated model of visual search. </w:t>
       </w:r>
       <w:r>
         <w:rPr>
@@ -17793,30 +17885,54 @@
           <w:iCs/>
           <w:lang w:val="en-GB"/>
         </w:rPr>
-        <w:t>28</w:t>
+        <w:t>Psychonomic Bulletin &amp; Review</w:t>
       </w:r>
       <w:r>
         <w:rPr>
           <w:rFonts w:cs="Times New Roman"/>
           <w:lang w:val="en-GB"/>
         </w:rPr>
-        <w:t>(4), 1060–1092. https://doi.org/10.3758/s13423-020-01859-9</w:t>
-      </w:r>
-    </w:p>
-    <w:p>
-      <w:pPr>
-        <w:pStyle w:val="Bibliography"/>
+        <w:t xml:space="preserve">, </w:t>
+      </w:r>
+      <w:r>
+        <w:rPr>
+          <w:rFonts w:cs="Times New Roman"/>
+          <w:i/>
+          <w:iCs/>
+          <w:lang w:val="en-GB"/>
+        </w:rPr>
+        <w:t>28</w:t>
+      </w:r>
+      <w:r>
         <w:rPr>
           <w:rFonts w:cs="Times New Roman"/>
           <w:lang w:val="en-GB"/>
         </w:rPr>
-      </w:pPr>
-      <w:r>
+        <w:t>(4), 1060–1092. https://doi.org/10.3758/s13423-020-01859-9</w:t>
+      </w:r>
+    </w:p>
+    <w:p>
+      <w:pPr>
+        <w:pStyle w:val="Bibliography"/>
         <w:rPr>
           <w:rFonts w:cs="Times New Roman"/>
           <w:lang w:val="en-GB"/>
         </w:rPr>
-        <w:t xml:space="preserve">Yang, Z., Huang, L., Chen, Y., Wei, Z., Ahn, S., Zelinsky, G., Samaras, D., &amp; Hoai, M. (2020). Predicting Goal-Directed Human Attention Using Inverse Reinforcement Learning. </w:t>
+      </w:pPr>
+      <w:r>
+        <w:rPr>
+          <w:rFonts w:cs="Times New Roman"/>
+          <w:lang w:val="en-GB"/>
+        </w:rPr>
+        <w:t xml:space="preserve">Yang, Z., Huang, L., Chen, Y., Wei, Z., Ahn, S., Zelinsky, G., Samaras, D., &amp; Hoai, M. (2020). Predicting Goal-Directed Human Attention Using Inverse </w:t>
+      </w:r>
+      <w:r>
+        <w:rPr>
+          <w:rFonts w:cs="Times New Roman"/>
+          <w:lang w:val="en-GB"/>
+        </w:rPr>
+        <w:lastRenderedPageBreak/>
+        <w:t xml:space="preserve">Reinforcement Learning. </w:t>
       </w:r>
       <w:r>
         <w:rPr>

</xml_diff>